<commit_message>
Kim11-2-14-Cozunurluge-Etki-Eden-Faktorler: gorsel alanlarina Shutter onizlemeleri yerlestirildi (2.3 bicimi)
</commit_message>
<xml_diff>
--- a/Kim11-2-14-Cozunurluge-Etki-Eden-Faktorler.docx
+++ b/Kim11-2-14-Cozunurluge-Etki-Eden-Faktorler.docx
@@ -62,77 +62,60 @@
           <w:tcPr>
             <w:tcW w:w="4500" w:type="dxa"/>
           </w:tcPr>
-          <w:tbl>
-            <w:tblPr>
-              <w:tblW w:w="4300" w:type="dxa"/>
+          <w:p>
+            <w:pPr>
               <w:jc w:val="center"/>
-              <w:tblBorders>
-                <w:top w:val="single" w:sz="8" w:space="0" w:color="7F7F7F"/>
-                <w:left w:val="single" w:sz="8" w:space="0" w:color="7F7F7F"/>
-                <w:bottom w:val="single" w:sz="8" w:space="0" w:color="7F7F7F"/>
-                <w:right w:val="single" w:sz="8" w:space="0" w:color="7F7F7F"/>
-              </w:tblBorders>
-            </w:tblPr>
-            <w:tblGrid>
-              <w:gridCol w:w="4300"/>
-            </w:tblGrid>
-            <w:tr>
-              <w:tc>
-                <w:tcPr>
-                  <w:tcW w:w="4300" w:type="dxa"/>
-                  <w:shd w:val="clear" w:color="auto" w:fill="EDEDED"/>
-                </w:tcPr>
-                <w:p>
-                  <w:pPr>
-                    <w:jc w:val="both"/>
-                    <w:rPr>
-                      <w:rFonts w:ascii="Times New Roman" w:hAnsi="Times New Roman" w:cs="Times New Roman"/>
-                      <w:lang w:val="tr-TR"/>
-                    </w:rPr>
-                  </w:pPr>
-                  <w:r>
-                    <w:rPr>
-                      <w:rFonts w:ascii="Times New Roman" w:hAnsi="Times New Roman" w:cs="Times New Roman"/>
-                      <w:lang w:val="tr-TR"/>
-                    </w:rPr>
-                    <w:t xml:space="preserve">GÖRSEL ALANI (Shutterstock)</w:t>
-                  </w:r>
-                </w:p>
-                <w:p>
-                  <w:pPr>
-                    <w:jc w:val="both"/>
-                    <w:rPr>
-                      <w:rFonts w:ascii="Times New Roman" w:hAnsi="Times New Roman" w:cs="Times New Roman"/>
-                      <w:lang w:val="tr-TR"/>
-                    </w:rPr>
-                  </w:pPr>
-                  <w:r>
-                    <w:rPr>
-                      <w:rFonts w:ascii="Times New Roman" w:hAnsi="Times New Roman" w:cs="Times New Roman"/>
-                      <w:lang w:val="tr-TR"/>
-                    </w:rPr>
-                    <w:t xml:space="preserve">Tarif: Elektrikli su ısıtıcısının (kettle) iç yüzeyinde ve rezistansında biriken beyaz kireç tabakası; yakın çekim, marka görünmeyen.</w:t>
-                  </w:r>
-                </w:p>
-                <w:p>
-                  <w:pPr>
-                    <w:jc w:val="both"/>
-                    <w:rPr>
-                      <w:rFonts w:ascii="Times New Roman" w:hAnsi="Times New Roman" w:cs="Times New Roman"/>
-                      <w:lang w:val="tr-TR"/>
-                    </w:rPr>
-                  </w:pPr>
-                  <w:r>
-                    <w:rPr>
-                      <w:rFonts w:ascii="Times New Roman" w:hAnsi="Times New Roman" w:cs="Times New Roman"/>
-                      <w:lang w:val="tr-TR"/>
-                    </w:rPr>
-                    <w:t xml:space="preserve">Shutter ID: 2404212001 (fotoğraf) — Scale inside the kettle close-up</w:t>
-                  </w:r>
-                </w:p>
-              </w:tc>
-            </w:tr>
-          </w:tbl>
+            </w:pPr>
+            <w:r>
+              <w:drawing>
+                <wp:inline xmlns:a="http://schemas.openxmlformats.org/drawingml/2006/main" xmlns:pic="http://schemas.openxmlformats.org/drawingml/2006/picture">
+                  <wp:extent cx="2664000" cy="1953600"/>
+                  <wp:docPr id="900014" name="Picture 900014"/>
+                  <wp:cNvGraphicFramePr>
+                    <a:graphicFrameLocks noChangeAspect="1"/>
+                  </wp:cNvGraphicFramePr>
+                  <a:graphic>
+                    <a:graphicData uri="http://schemas.openxmlformats.org/drawingml/2006/picture">
+                      <pic:pic>
+                        <pic:nvPicPr>
+                          <pic:cNvPr id="0" name="2404212001_d.jpg"/>
+                          <pic:cNvPicPr/>
+                        </pic:nvPicPr>
+                        <pic:blipFill>
+                          <a:blip r:embed="rId12"/>
+                          <a:stretch>
+                            <a:fillRect/>
+                          </a:stretch>
+                        </pic:blipFill>
+                        <pic:spPr>
+                          <a:xfrm>
+                            <a:off x="0" y="0"/>
+                            <a:ext cx="2664000" cy="1953600"/>
+                          </a:xfrm>
+                          <a:prstGeom prst="rect"/>
+                        </pic:spPr>
+                      </pic:pic>
+                    </a:graphicData>
+                  </a:graphic>
+                </wp:inline>
+              </w:drawing>
+            </w:r>
+          </w:p>
+          <w:p>
+            <w:pPr>
+              <w:jc w:val="center"/>
+            </w:pPr>
+            <w:r>
+              <w:rPr>
+                <w:rFonts w:ascii="Times New Roman" w:hAnsi="Times New Roman" w:cs="Times New Roman"/>
+                <w:b/>
+                <w:bCs/>
+                <w:highlight w:val="yellow"/>
+                <w:lang w:val="tr-TR"/>
+              </w:rPr>
+              <w:t xml:space="preserve">Shutter id: 2404212001</w:t>
+            </w:r>
+          </w:p>
           <w:p>
             <w:pPr>
               <w:jc w:val="center"/>

</xml_diff>

<commit_message>
2.13 Bilgi Kosesi 2.3 altina iki gorsel; 2.14 Sicaklik ve Diger Etkiler bolumlerine iki cift gorsel (C-F) ve metin atiflari; 2.11 ve 2.12 yayina yollananlara tasindi
</commit_message>
<xml_diff>
--- a/Kim11-2-14-Cozunurluge-Etki-Eden-Faktorler.docx
+++ b/Kim11-2-14-Cozunurluge-Etki-Eden-Faktorler.docx
@@ -307,43 +307,7 @@
           <w:highlight w:val="yellow"/>
           <w:lang w:val="tr-TR"/>
         </w:rPr>
-        <w:t xml:space="preserve">Etkinlik başlığının yanına Kimya10 kitabındaki “Temel Uyarı ve Güvenlik İşaretleri” sayfasından şu işaretler konulsun: GÖZLÜK KULLAN, ELDİVEN GİY, KORUYUCU ELBİSE GİY, KOROZİF (AŞINDIRICI) MADDE, TAHRİŞ EDİCİ MADDE, MASKE KULLAN, SICAK CİSİM UYARISI, YANICI MADDE, KIRILABİLİR CAM UYARISI. Ek uyarılar: Derişik </w:t>
-      </w:r>
-      <w:proofErr w:type="spellStart"/>
-      <w:r>
-        <w:rPr>
-          <w:rFonts w:ascii="Times New Roman" w:hAnsi="Times New Roman" w:cs="Times New Roman"/>
-          <w:highlight w:val="yellow"/>
-          <w:lang w:val="tr-TR"/>
-        </w:rPr>
-        <w:t>HCl</w:t>
-      </w:r>
-      <w:proofErr w:type="spellEnd"/>
-      <w:r>
-        <w:rPr>
-          <w:rFonts w:ascii="Times New Roman" w:hAnsi="Times New Roman" w:cs="Times New Roman"/>
-          <w:highlight w:val="yellow"/>
-          <w:lang w:val="tr-TR"/>
-        </w:rPr>
-        <w:t xml:space="preserve"> ile yapılan deney öğretmen tarafından gösteri deneyi olarak çeker ocakta yapılmalıdır. Kurşun bileşikleri zehirli olduğundan </w:t>
-      </w:r>
-      <w:proofErr w:type="gramStart"/>
-      <w:r>
-        <w:rPr>
-          <w:rFonts w:ascii="Times New Roman" w:hAnsi="Times New Roman" w:cs="Times New Roman"/>
-          <w:highlight w:val="yellow"/>
-          <w:lang w:val="tr-TR"/>
-        </w:rPr>
-        <w:t>kurşun(</w:t>
-      </w:r>
-      <w:proofErr w:type="gramEnd"/>
-      <w:r>
-        <w:rPr>
-          <w:rFonts w:ascii="Times New Roman" w:hAnsi="Times New Roman" w:cs="Times New Roman"/>
-          <w:highlight w:val="yellow"/>
-          <w:lang w:val="tr-TR"/>
-        </w:rPr>
-        <w:t>II) iyodür deneyi yalnızca videodan izlenecektir.</w:t>
+        <w:t>Etkinlik başlığının yanına Kimya10 kitabındaki “Temel Uyarı ve Güvenlik İşaretleri” sayfasından şu işaretler konulsun: GÖZLÜK KULLAN, ELDİVEN GİY, KORUYUCU ELBİSE GİY, KOROZİF (AŞINDIRICI) MADDE, TAHRİŞ EDİCİ MADDE, MASKE KULLAN, SICAK CİSİM UYARISI, YANICI MADDE, KIRILABİLİR CAM UYARISI.</w:t>
       </w:r>
     </w:p>
     <w:p>
@@ -377,8 +341,15 @@
           <w:rFonts w:ascii="Times New Roman" w:hAnsi="Times New Roman" w:cs="Times New Roman"/>
           <w:lang w:val="tr-TR"/>
         </w:rPr>
+        <w:t xml:space="preserve">Sınıfınızda gruplara ayrılınız. Suda az çözünen tuzların çözünürlüğüne etki eden faktörleri gözlemleyebileceğiniz farklı ortamlar oluşturunuz. Bunun için deney basamaklarını takip ederek aşağıdaki deneyleri gerçekleştirebilir, deney videolarını izleyebilir ya da sanal laboratuvar </w:t>
+      </w:r>
+      <w:r>
+        <w:rPr>
+          <w:rFonts w:ascii="Times New Roman" w:hAnsi="Times New Roman" w:cs="Times New Roman"/>
+          <w:lang w:val="tr-TR"/>
+        </w:rPr>
         <w:lastRenderedPageBreak/>
-        <w:t>Sınıfınızda gruplara ayrılınız. Suda az çözünen tuzların çözünürlüğüne etki eden faktörleri gözlemleyebileceğiniz farklı ortamlar oluşturunuz. Bunun için deney basamaklarını takip ederek aşağıdaki deneyleri gerçekleştirebilir, deney videolarını izleyebilir ya da sanal laboratuvar uygulamalarını kullanabilirsiniz. Kullandığınız dijital kaynakların güvenilir olmasına dikkat ediniz. Gözlem yapmadan önce çözünürlükteki değişimi hangi gözlenebilir niteliklerden (bulanıklaşma, çökelti ya da kristal oluşumu, çözeltinin berraklaşması vb.) anlayabileceğinizi grubunuzla belirleyiniz. Gözlemlerinizi tabloya kaydediniz.</w:t>
+        <w:t>uygulamalarını kullanabilirsiniz. Kullandığınız dijital kaynakların güvenilir olmasına dikkat ediniz. Gözlem yapmadan önce çözünürlükteki değişimi hangi gözlenebilir niteliklerden (bulanıklaşma, çökelti ya da kristal oluşumu, çözeltinin berraklaşması vb.) anlayabileceğinizi grubunuzla belirleyiniz. Gözlemlerinizi tabloya kaydediniz.</w:t>
       </w:r>
     </w:p>
     <w:p>
@@ -918,15 +889,7 @@
           <w:rFonts w:ascii="Times New Roman" w:hAnsi="Times New Roman" w:cs="Times New Roman"/>
           <w:lang w:val="tr-TR"/>
         </w:rPr>
-        <w:t xml:space="preserve"> değerleri ve molar çözünürlükleri yer almaktadır. Molar </w:t>
-      </w:r>
-      <w:r>
-        <w:rPr>
-          <w:rFonts w:ascii="Times New Roman" w:hAnsi="Times New Roman" w:cs="Times New Roman"/>
-          <w:lang w:val="tr-TR"/>
-        </w:rPr>
-        <w:lastRenderedPageBreak/>
-        <w:t>çözünürlük ve K</w:t>
+        <w:t xml:space="preserve"> değerleri ve molar çözünürlükleri yer almaktadır. Molar çözünürlük ve K</w:t>
       </w:r>
       <w:r>
         <w:rPr>
@@ -991,6 +954,7 @@
                 <w:bCs/>
                 <w:lang w:val="tr-TR"/>
               </w:rPr>
+              <w:lastRenderedPageBreak/>
               <w:t>Çözücü ortam</w:t>
             </w:r>
           </w:p>
@@ -2177,84 +2141,6 @@
     </w:p>
     <w:p>
       <w:pPr>
-        <w:jc w:val="both"/>
-        <w:rPr>
-          <w:rFonts w:ascii="Times New Roman" w:hAnsi="Times New Roman" w:cs="Times New Roman"/>
-          <w:lang w:val="tr-TR"/>
-        </w:rPr>
-      </w:pPr>
-      <w:r>
-        <w:rPr>
-          <w:rFonts w:ascii="Times New Roman" w:hAnsi="Times New Roman" w:cs="Times New Roman"/>
-          <w:b/>
-          <w:bCs/>
-          <w:highlight w:val="yellow"/>
-          <w:lang w:val="tr-TR"/>
-        </w:rPr>
-        <w:t xml:space="preserve">NOT: </w:t>
-      </w:r>
-      <w:r>
-        <w:rPr>
-          <w:rFonts w:ascii="Times New Roman" w:hAnsi="Times New Roman" w:cs="Times New Roman"/>
-          <w:highlight w:val="yellow"/>
-          <w:lang w:val="tr-TR"/>
-        </w:rPr>
-        <w:t>İkinci tablodaki XY ve ZW tuzlarına ait veriler öğretim amaçlı hazırlanmış verilerdir (K</w:t>
-      </w:r>
-      <w:r>
-        <w:rPr>
-          <w:rFonts w:ascii="Times New Roman" w:hAnsi="Times New Roman" w:cs="Times New Roman"/>
-          <w:highlight w:val="yellow"/>
-          <w:vertAlign w:val="subscript"/>
-          <w:lang w:val="tr-TR"/>
-        </w:rPr>
-        <w:t>çç</w:t>
-      </w:r>
-      <w:r>
-        <w:rPr>
-          <w:rFonts w:ascii="Times New Roman" w:hAnsi="Times New Roman" w:cs="Times New Roman"/>
-          <w:highlight w:val="yellow"/>
-          <w:lang w:val="tr-TR"/>
-        </w:rPr>
-        <w:t xml:space="preserve"> = s</w:t>
-      </w:r>
-      <w:r>
-        <w:rPr>
-          <w:rFonts w:ascii="Times New Roman" w:hAnsi="Times New Roman" w:cs="Times New Roman"/>
-          <w:highlight w:val="yellow"/>
-          <w:vertAlign w:val="superscript"/>
-          <w:lang w:val="tr-TR"/>
-        </w:rPr>
-        <w:t>2</w:t>
-      </w:r>
-      <w:r>
-        <w:rPr>
-          <w:rFonts w:ascii="Times New Roman" w:hAnsi="Times New Roman" w:cs="Times New Roman"/>
-          <w:highlight w:val="yellow"/>
-          <w:lang w:val="tr-TR"/>
-        </w:rPr>
-        <w:t xml:space="preserve"> ilişkisine uygun olarak hesaplanmıştır). Birinci tablodaki değerler AgCl’nin gerçek K</w:t>
-      </w:r>
-      <w:r>
-        <w:rPr>
-          <w:rFonts w:ascii="Times New Roman" w:hAnsi="Times New Roman" w:cs="Times New Roman"/>
-          <w:highlight w:val="yellow"/>
-          <w:vertAlign w:val="subscript"/>
-          <w:lang w:val="tr-TR"/>
-        </w:rPr>
-        <w:t>çç</w:t>
-      </w:r>
-      <w:r>
-        <w:rPr>
-          <w:rFonts w:ascii="Times New Roman" w:hAnsi="Times New Roman" w:cs="Times New Roman"/>
-          <w:highlight w:val="yellow"/>
-          <w:lang w:val="tr-TR"/>
-        </w:rPr>
-        <w:t xml:space="preserve"> değerinden hesaplanmıştır.</w:t>
-      </w:r>
-    </w:p>
-    <w:p>
-      <w:pPr>
         <w:pStyle w:val="ListParagraph"/>
         <w:numPr>
           <w:ilvl w:val="0"/>
@@ -2445,58 +2331,58 @@
           <w:rFonts w:ascii="Times New Roman" w:hAnsi="Times New Roman" w:cs="Times New Roman"/>
           <w:lang w:val="tr-TR"/>
         </w:rPr>
+        <w:t>İkinci tablodaki verileri kullanarak sıcaklığın XY ve ZW tuzlarının çözünürlüğüne etkisine ilişkin çıkarımlarda bulununuz. Bu iki tuzun çözünme olaylarından hangisi endotermik, hangisi ekzotermik olabilir? Gerekçelendiriniz.</w:t>
+      </w:r>
+    </w:p>
+    <w:p>
+      <w:pPr>
+        <w:ind w:left="720"/>
+        <w:jc w:val="both"/>
+        <w:rPr>
+          <w:rFonts w:ascii="Times New Roman" w:hAnsi="Times New Roman" w:cs="Times New Roman"/>
+          <w:lang w:val="tr-TR"/>
+        </w:rPr>
+      </w:pPr>
+      <w:r>
+        <w:rPr>
+          <w:rFonts w:ascii="Times New Roman" w:hAnsi="Times New Roman" w:cs="Times New Roman"/>
+          <w:lang w:val="tr-TR"/>
+        </w:rPr>
+        <w:t>……………………………………………………………………………………………</w:t>
+      </w:r>
+    </w:p>
+    <w:p>
+      <w:pPr>
+        <w:ind w:left="720"/>
+        <w:jc w:val="both"/>
+        <w:rPr>
+          <w:rFonts w:ascii="Times New Roman" w:hAnsi="Times New Roman" w:cs="Times New Roman"/>
+          <w:lang w:val="tr-TR"/>
+        </w:rPr>
+      </w:pPr>
+      <w:r>
+        <w:rPr>
+          <w:rFonts w:ascii="Times New Roman" w:hAnsi="Times New Roman" w:cs="Times New Roman"/>
+          <w:lang w:val="tr-TR"/>
+        </w:rPr>
+        <w:t>……………………………………………………………………………………………</w:t>
+      </w:r>
+    </w:p>
+    <w:p>
+      <w:pPr>
+        <w:ind w:left="720"/>
+        <w:jc w:val="both"/>
+        <w:rPr>
+          <w:rFonts w:ascii="Times New Roman" w:hAnsi="Times New Roman" w:cs="Times New Roman"/>
+          <w:lang w:val="tr-TR"/>
+        </w:rPr>
+      </w:pPr>
+      <w:r>
+        <w:rPr>
+          <w:rFonts w:ascii="Times New Roman" w:hAnsi="Times New Roman" w:cs="Times New Roman"/>
+          <w:lang w:val="tr-TR"/>
+        </w:rPr>
         <w:lastRenderedPageBreak/>
-        <w:t>İkinci tablodaki verileri kullanarak sıcaklığın XY ve ZW tuzlarının çözünürlüğüne etkisine ilişkin çıkarımlarda bulununuz. Bu iki tuzun çözünme olaylarından hangisi endotermik, hangisi ekzotermik olabilir? Gerekçelendiriniz.</w:t>
-      </w:r>
-    </w:p>
-    <w:p>
-      <w:pPr>
-        <w:ind w:left="720"/>
-        <w:jc w:val="both"/>
-        <w:rPr>
-          <w:rFonts w:ascii="Times New Roman" w:hAnsi="Times New Roman" w:cs="Times New Roman"/>
-          <w:lang w:val="tr-TR"/>
-        </w:rPr>
-      </w:pPr>
-      <w:r>
-        <w:rPr>
-          <w:rFonts w:ascii="Times New Roman" w:hAnsi="Times New Roman" w:cs="Times New Roman"/>
-          <w:lang w:val="tr-TR"/>
-        </w:rPr>
-        <w:t>……………………………………………………………………………………………</w:t>
-      </w:r>
-    </w:p>
-    <w:p>
-      <w:pPr>
-        <w:ind w:left="720"/>
-        <w:jc w:val="both"/>
-        <w:rPr>
-          <w:rFonts w:ascii="Times New Roman" w:hAnsi="Times New Roman" w:cs="Times New Roman"/>
-          <w:lang w:val="tr-TR"/>
-        </w:rPr>
-      </w:pPr>
-      <w:r>
-        <w:rPr>
-          <w:rFonts w:ascii="Times New Roman" w:hAnsi="Times New Roman" w:cs="Times New Roman"/>
-          <w:lang w:val="tr-TR"/>
-        </w:rPr>
-        <w:t>……………………………………………………………………………………………</w:t>
-      </w:r>
-    </w:p>
-    <w:p>
-      <w:pPr>
-        <w:ind w:left="720"/>
-        <w:jc w:val="both"/>
-        <w:rPr>
-          <w:rFonts w:ascii="Times New Roman" w:hAnsi="Times New Roman" w:cs="Times New Roman"/>
-          <w:lang w:val="tr-TR"/>
-        </w:rPr>
-      </w:pPr>
-      <w:r>
-        <w:rPr>
-          <w:rFonts w:ascii="Times New Roman" w:hAnsi="Times New Roman" w:cs="Times New Roman"/>
-          <w:lang w:val="tr-TR"/>
-        </w:rPr>
         <w:t>……………………………………………………………………………………………</w:t>
       </w:r>
     </w:p>
@@ -2662,7 +2548,7 @@
         <mc:AlternateContent>
           <mc:Choice Requires="wps">
             <w:drawing>
-              <wp:anchor distT="0" distB="0" distL="114300" distR="114300" simplePos="0" relativeHeight="251653120" behindDoc="0" locked="0" layoutInCell="1" allowOverlap="1" wp14:anchorId="7B45EE9E" wp14:editId="44E02D57">
+              <wp:anchor distT="0" distB="0" distL="114300" distR="114300" simplePos="0" relativeHeight="251652096" behindDoc="0" locked="0" layoutInCell="1" allowOverlap="1" wp14:anchorId="7B45EE9E" wp14:editId="44E02D57">
                 <wp:simplePos x="0" y="0"/>
                 <wp:positionH relativeFrom="column">
                   <wp:posOffset>498916</wp:posOffset>
@@ -2954,52 +2840,52 @@
           <w:rFonts w:ascii="Times New Roman" w:hAnsi="Times New Roman" w:cs="Times New Roman"/>
           <w:lang w:val="tr-TR"/>
         </w:rPr>
+        <w:t>Bunun sonucunda bir miktar BaSO</w:t>
+      </w:r>
+      <w:r>
+        <w:rPr>
+          <w:rFonts w:ascii="Times New Roman" w:hAnsi="Times New Roman" w:cs="Times New Roman"/>
+          <w:vertAlign w:val="subscript"/>
+          <w:lang w:val="tr-TR"/>
+        </w:rPr>
+        <w:t>4</w:t>
+      </w:r>
+      <w:r>
+        <w:rPr>
+          <w:rFonts w:ascii="Times New Roman" w:hAnsi="Times New Roman" w:cs="Times New Roman"/>
+          <w:lang w:val="tr-TR"/>
+        </w:rPr>
+        <w:t xml:space="preserve"> çöker ve tuzun çözünürlüğü azalır. Ortak iyon içeren bir çözeltide tuzun çözünürlüğünün saf sudakinden daha az olmasına ortak iyon etkisi denir. Ortak iyonun derişimi arttıkça çözünürlük daha da azalır (Grafik A). Ortak iyon etkisi tuzun çözünürlüğünü değiştirir ancak sıcaklık sabit olduğu için K</w:t>
+      </w:r>
+      <w:r>
+        <w:rPr>
+          <w:rFonts w:ascii="Times New Roman" w:hAnsi="Times New Roman" w:cs="Times New Roman"/>
+          <w:vertAlign w:val="subscript"/>
+          <w:lang w:val="tr-TR"/>
+        </w:rPr>
+        <w:t>çç</w:t>
+      </w:r>
+      <w:r>
+        <w:rPr>
+          <w:rFonts w:ascii="Times New Roman" w:hAnsi="Times New Roman" w:cs="Times New Roman"/>
+          <w:lang w:val="tr-TR"/>
+        </w:rPr>
+        <w:t xml:space="preserve"> değerini değiştirmez.</w:t>
+      </w:r>
+    </w:p>
+    <w:p>
+      <w:pPr>
+        <w:jc w:val="center"/>
+        <w:rPr>
+          <w:rFonts w:ascii="Times New Roman" w:hAnsi="Times New Roman" w:cs="Times New Roman"/>
+          <w:lang w:val="tr-TR"/>
+        </w:rPr>
+      </w:pPr>
+      <w:r>
+        <w:rPr>
+          <w:noProof/>
+        </w:rPr>
         <w:lastRenderedPageBreak/>
-        <w:t>Bunun sonucunda bir miktar BaSO</w:t>
-      </w:r>
-      <w:r>
-        <w:rPr>
-          <w:rFonts w:ascii="Times New Roman" w:hAnsi="Times New Roman" w:cs="Times New Roman"/>
-          <w:vertAlign w:val="subscript"/>
-          <w:lang w:val="tr-TR"/>
-        </w:rPr>
-        <w:t>4</w:t>
-      </w:r>
-      <w:r>
-        <w:rPr>
-          <w:rFonts w:ascii="Times New Roman" w:hAnsi="Times New Roman" w:cs="Times New Roman"/>
-          <w:lang w:val="tr-TR"/>
-        </w:rPr>
-        <w:t xml:space="preserve"> çöker ve tuzun çözünürlüğü azalır. Ortak iyon içeren bir çözeltide tuzun çözünürlüğünün saf sudakinden daha az olmasına ortak iyon etkisi denir. Ortak iyonun derişimi arttıkça çözünürlük daha da azalır (Grafik A). Ortak iyon etkisi tuzun çözünürlüğünü değiştirir ancak sıcaklık sabit olduğu için K</w:t>
-      </w:r>
-      <w:r>
-        <w:rPr>
-          <w:rFonts w:ascii="Times New Roman" w:hAnsi="Times New Roman" w:cs="Times New Roman"/>
-          <w:vertAlign w:val="subscript"/>
-          <w:lang w:val="tr-TR"/>
-        </w:rPr>
-        <w:t>çç</w:t>
-      </w:r>
-      <w:r>
-        <w:rPr>
-          <w:rFonts w:ascii="Times New Roman" w:hAnsi="Times New Roman" w:cs="Times New Roman"/>
-          <w:lang w:val="tr-TR"/>
-        </w:rPr>
-        <w:t xml:space="preserve"> değerini değiştirmez.</w:t>
-      </w:r>
-    </w:p>
-    <w:p>
-      <w:pPr>
-        <w:jc w:val="center"/>
-        <w:rPr>
-          <w:rFonts w:ascii="Times New Roman" w:hAnsi="Times New Roman" w:cs="Times New Roman"/>
-          <w:lang w:val="tr-TR"/>
-        </w:rPr>
-      </w:pPr>
-      <w:r>
-        <w:rPr>
-          <w:noProof/>
-        </w:rPr>
         <w:drawing>
           <wp:inline distT="0" distB="0" distL="0" distR="0" wp14:anchorId="67384BE1" wp14:editId="75C3D871">
             <wp:extent cx="4678689" cy="2618237"/>
@@ -3433,7 +3319,6 @@
           <w:rFonts w:ascii="Times New Roman" w:hAnsi="Times New Roman" w:cs="Times New Roman"/>
           <w:lang w:val="tr-TR"/>
         </w:rPr>
-        <w:lastRenderedPageBreak/>
         <w:t>Grafik B: Doymuş BaSO</w:t>
       </w:r>
       <w:r>
@@ -3513,6 +3398,7 @@
           <w:bCs/>
           <w:lang w:val="tr-TR"/>
         </w:rPr>
+        <w:lastRenderedPageBreak/>
         <w:t>Sıcaklık</w:t>
       </w:r>
     </w:p>
@@ -3681,7 +3567,7 @@
           <w:rFonts w:ascii="Times New Roman" w:hAnsi="Times New Roman" w:cs="Times New Roman"/>
           <w:lang w:val="tr-TR"/>
         </w:rPr>
-        <w:t>’nin sudaki çözünürlüğü 20 °C’de litrede yaklaşık 10 g iken 100 °C’de yaklaşık 33 g’dır. Tuzların çoğunun çözünmesi endotermiktir ve çözünürlükleri sıcaklıkla artar. Çözünmesi ekzotermik olan tuzlarda ise ısı, ürünler tarafında düşünülebilir. Lityum karbonat (Li</w:t>
+        <w:t>’nin sudaki çözünürlüğü 20 °C’de litrede yaklaşık 10 g iken 100 °C’de yaklaşık 33 g’dır. Tuzların çoğunun çözünmesi endotermiktir ve çözünürlükleri sıcaklıkla artar. Bu nedenle sıcakta hazırlanan doymuş bir çözelti soğutulduğunda çözünmüş tuzun bir kısmı kristaller hâlinde ayrılır (Görsel C). Çözünmesi ekzotermik olan tuzlarda ise ısı, ürünler tarafında düşünülebilir. Lityum karbonat (Li</w:t>
       </w:r>
       <w:r>
         <w:rPr>
@@ -3925,7 +3811,7 @@
           <w:rFonts w:ascii="Times New Roman" w:hAnsi="Times New Roman" w:cs="Times New Roman"/>
           <w:lang w:val="tr-TR"/>
         </w:rPr>
-        <w:t xml:space="preserve"> hâlinde çökmesiyle gerçekleşir. Bu olayda ısıtmayla sudan CO</w:t>
+        <w:t xml:space="preserve"> hâlinde çökmesiyle gerçekleşir (Görsel D). Bu olayda ısıtmayla sudan CO</w:t>
       </w:r>
       <w:r>
         <w:rPr>
@@ -3943,6 +3829,199 @@
         <w:t xml:space="preserve"> gazının uzaklaşması da dengeyi çökelme yönüne kaydırır.</w:t>
       </w:r>
     </w:p>
+    <w:tbl>
+      <w:tblPr>
+        <w:tblW w:w="9000" w:type="dxa"/>
+        <w:jc w:val="center"/>
+        <w:tblBorders>
+          <w:top w:val="nil"/>
+          <w:left w:val="nil"/>
+          <w:bottom w:val="nil"/>
+          <w:right w:val="nil"/>
+          <w:insideH w:val="nil"/>
+          <w:insideV w:val="nil"/>
+        </w:tblBorders>
+        <w:tblLayout w:type="fixed"/>
+        <w:tblLook w:val="04A0" w:firstRow="1" w:lastRow="0" w:firstColumn="1" w:lastColumn="0" w:noHBand="0" w:noVBand="1"/>
+      </w:tblPr>
+      <w:tblGrid>
+        <w:gridCol w:w="4500"/>
+        <w:gridCol w:w="4500"/>
+      </w:tblGrid>
+      <w:tr>
+        <w:trPr>
+          <w:jc w:val="center"/>
+        </w:trPr>
+        <w:tc>
+          <w:tcPr>
+            <w:tcW w:w="4500" w:type="dxa"/>
+          </w:tcPr>
+          <w:p>
+            <w:pPr>
+              <w:jc w:val="center"/>
+            </w:pPr>
+            <w:r>
+              <w:drawing>
+                <wp:inline xmlns:a="http://schemas.openxmlformats.org/drawingml/2006/main" xmlns:pic="http://schemas.openxmlformats.org/drawingml/2006/picture">
+                  <wp:extent cx="2628000" cy="1928952"/>
+                  <wp:docPr id="914607251" name="Picture 914607251"/>
+                  <wp:cNvGraphicFramePr>
+                    <a:graphicFrameLocks noChangeAspect="1"/>
+                  </wp:cNvGraphicFramePr>
+                  <a:graphic>
+                    <a:graphicData uri="http://schemas.openxmlformats.org/drawingml/2006/picture">
+                      <pic:pic>
+                        <pic:nvPicPr>
+                          <pic:cNvPr id="0" name="1854380248_d.jpg"/>
+                          <pic:cNvPicPr/>
+                        </pic:nvPicPr>
+                        <pic:blipFill>
+                          <a:blip r:embed="rId21"/>
+                          <a:stretch>
+                            <a:fillRect/>
+                          </a:stretch>
+                        </pic:blipFill>
+                        <pic:spPr>
+                          <a:xfrm>
+                            <a:off x="0" y="0"/>
+                            <a:ext cx="2628000" cy="1928952"/>
+                          </a:xfrm>
+                          <a:prstGeom prst="rect"/>
+                        </pic:spPr>
+                      </pic:pic>
+                    </a:graphicData>
+                  </a:graphic>
+                </wp:inline>
+              </w:drawing>
+            </w:r>
+          </w:p>
+          <w:p>
+            <w:pPr>
+              <w:jc w:val="center"/>
+            </w:pPr>
+            <w:r>
+              <w:rPr>
+                <w:rFonts w:ascii="Times New Roman" w:hAnsi="Times New Roman" w:cs="Times New Roman"/>
+                <w:b/>
+                <w:bCs/>
+                <w:highlight w:val="yellow"/>
+                <w:lang w:val="tr-TR"/>
+              </w:rPr>
+              <w:t>Shutter id: 1854380248</w:t>
+            </w:r>
+          </w:p>
+          <w:p>
+            <w:pPr>
+              <w:jc w:val="center"/>
+              <w:rPr>
+                <w:rFonts w:ascii="Times New Roman" w:hAnsi="Times New Roman" w:cs="Times New Roman"/>
+                <w:lang w:val="tr-TR"/>
+              </w:rPr>
+            </w:pPr>
+            <w:r>
+              <w:rPr>
+                <w:rFonts w:ascii="Times New Roman" w:hAnsi="Times New Roman" w:cs="Times New Roman"/>
+                <w:b/>
+                <w:bCs/>
+                <w:lang w:val="tr-TR"/>
+              </w:rPr>
+              <w:t>Görsel C:</w:t>
+            </w:r>
+            <w:r>
+              <w:rPr>
+                <w:rFonts w:ascii="Times New Roman" w:hAnsi="Times New Roman" w:cs="Times New Roman"/>
+                <w:lang w:val="tr-TR"/>
+              </w:rPr>
+              <w:t xml:space="preserve"> Soğutulan doymuş çözeltide ipe tutunarak büyüyen bakır(II) sülfat kristalleri</w:t>
+            </w:r>
+          </w:p>
+        </w:tc>
+        <w:tc>
+          <w:tcPr>
+            <w:tcW w:w="4500" w:type="dxa"/>
+          </w:tcPr>
+          <w:p>
+            <w:pPr>
+              <w:jc w:val="center"/>
+            </w:pPr>
+            <w:r>
+              <w:drawing>
+                <wp:inline xmlns:a="http://schemas.openxmlformats.org/drawingml/2006/main" xmlns:pic="http://schemas.openxmlformats.org/drawingml/2006/picture">
+                  <wp:extent cx="2628000" cy="1925448"/>
+                  <wp:docPr id="914607251" name="Picture 914607251"/>
+                  <wp:cNvGraphicFramePr>
+                    <a:graphicFrameLocks noChangeAspect="1"/>
+                  </wp:cNvGraphicFramePr>
+                  <a:graphic>
+                    <a:graphicData uri="http://schemas.openxmlformats.org/drawingml/2006/picture">
+                      <pic:pic>
+                        <pic:nvPicPr>
+                          <pic:cNvPr id="0" name="image.jpg"/>
+                          <pic:cNvPicPr/>
+                        </pic:nvPicPr>
+                        <pic:blipFill>
+                          <a:blip r:embed="rId17"/>
+                          <a:stretch>
+                            <a:fillRect/>
+                          </a:stretch>
+                        </pic:blipFill>
+                        <pic:spPr>
+                          <a:xfrm>
+                            <a:off x="0" y="0"/>
+                            <a:ext cx="2628000" cy="1925448"/>
+                          </a:xfrm>
+                          <a:prstGeom prst="rect"/>
+                        </pic:spPr>
+                      </pic:pic>
+                    </a:graphicData>
+                  </a:graphic>
+                </wp:inline>
+              </w:drawing>
+            </w:r>
+          </w:p>
+          <w:p>
+            <w:pPr>
+              <w:jc w:val="center"/>
+            </w:pPr>
+            <w:r>
+              <w:rPr>
+                <w:rFonts w:ascii="Times New Roman" w:hAnsi="Times New Roman" w:cs="Times New Roman"/>
+                <w:b/>
+                <w:bCs/>
+                <w:highlight w:val="yellow"/>
+                <w:lang w:val="tr-TR"/>
+              </w:rPr>
+              <w:t>Shutter id: 2452779707</w:t>
+            </w:r>
+          </w:p>
+          <w:p>
+            <w:pPr>
+              <w:jc w:val="center"/>
+              <w:rPr>
+                <w:rFonts w:ascii="Times New Roman" w:hAnsi="Times New Roman" w:cs="Times New Roman"/>
+                <w:lang w:val="tr-TR"/>
+              </w:rPr>
+            </w:pPr>
+            <w:r>
+              <w:rPr>
+                <w:rFonts w:ascii="Times New Roman" w:hAnsi="Times New Roman" w:cs="Times New Roman"/>
+                <w:b/>
+                <w:bCs/>
+                <w:lang w:val="tr-TR"/>
+              </w:rPr>
+              <w:t>Görsel D:</w:t>
+            </w:r>
+            <w:r>
+              <w:rPr>
+                <w:rFonts w:ascii="Times New Roman" w:hAnsi="Times New Roman" w:cs="Times New Roman"/>
+                <w:lang w:val="tr-TR"/>
+              </w:rPr>
+              <w:t xml:space="preserve"> Termosifonun ısıtıcısında biriken kireç</w:t>
+            </w:r>
+          </w:p>
+        </w:tc>
+      </w:tr>
+    </w:tbl>
     <w:p>
       <w:pPr>
         <w:keepNext/>
@@ -4073,7 +4152,7 @@
           <w:rFonts w:ascii="Times New Roman" w:hAnsi="Times New Roman" w:cs="Times New Roman"/>
           <w:lang w:val="tr-TR"/>
         </w:rPr>
-        <w:t xml:space="preserve"> iyonlarıyla tepkimeye girer. Bu iyonların derişimi azaldığı için katının bir kısmı çözünür; tuzun bu ortamdaki çözünürlüğü artar, K</w:t>
+        <w:t xml:space="preserve"> iyonlarıyla tepkimeye girer. Bu iyonların derişimi azaldığı için katının bir kısmı çözünür (Görsel E); tuzun bu ortamdaki çözünürlüğü artar, K</w:t>
       </w:r>
       <w:r>
         <w:rPr>
@@ -4104,15 +4183,7 @@
           <w:rFonts w:ascii="Times New Roman" w:hAnsi="Times New Roman" w:cs="Times New Roman"/>
           <w:lang w:val="tr-TR"/>
         </w:rPr>
-        <w:t xml:space="preserve">Peki dibinde katısı bulunan doymuş bir çözeltiye su eklemek ya da çözeltiden su buharlaştırmak iyon derişimlerini değiştirir mi? Dibinde katısı bulunan doymuş bir çözeltiye sabit sıcaklıkta su eklenirse katının bir kısmı çözünür; katı tamamen bitmediği sürece çözelti yine doymuş kalır ve iyon derişimleri değişmez. Doymuş çözeltiden sabit sıcaklıkta bir miktar su buharlaştırılırsa bir miktar tuz çöker; iyon derişimleri yine değişmez. Dengedeki çözeltiye aynı tuzun katısından eklemek ise çözünmüş iyonların derişimini değiştirmez. Sıcaklık sabit kaldığı ve çözelti doymuş </w:t>
-      </w:r>
-      <w:r>
-        <w:rPr>
-          <w:rFonts w:ascii="Times New Roman" w:hAnsi="Times New Roman" w:cs="Times New Roman"/>
-          <w:lang w:val="tr-TR"/>
-        </w:rPr>
-        <w:lastRenderedPageBreak/>
-        <w:t>olduğu sürece iyon derişimleri K</w:t>
+        <w:t>Peki dibinde katısı bulunan doymuş bir çözeltiye su eklemek ya da çözeltiden su buharlaştırmak iyon derişimlerini değiştirir mi? Dibinde katısı bulunan doymuş bir çözeltiye sabit sıcaklıkta su eklenirse katının bir kısmı çözünür; katı tamamen bitmediği sürece çözelti yine doymuş kalır ve iyon derişimleri değişmez. Doymuş çözeltiden sabit sıcaklıkta bir miktar su buharlaştırılırsa bir miktar tuz çöker (Görsel F); iyon derişimleri yine değişmez. Dengedeki çözeltiye aynı tuzun katısından eklemek ise çözünmüş iyonların derişimini değiştirmez. Sıcaklık sabit kaldığı ve çözelti doymuş olduğu sürece iyon derişimleri K</w:t>
       </w:r>
       <w:r>
         <w:rPr>
@@ -4130,6 +4201,199 @@
         <w:t xml:space="preserve"> değeriyle belirlendiği için bu işlemler yalnızca çözünmüş ve katı hâldeki tuz miktarlarını değiştirir.</w:t>
       </w:r>
     </w:p>
+    <w:tbl>
+      <w:tblPr>
+        <w:tblW w:w="9000" w:type="dxa"/>
+        <w:jc w:val="center"/>
+        <w:tblBorders>
+          <w:top w:val="nil"/>
+          <w:left w:val="nil"/>
+          <w:bottom w:val="nil"/>
+          <w:right w:val="nil"/>
+          <w:insideH w:val="nil"/>
+          <w:insideV w:val="nil"/>
+        </w:tblBorders>
+        <w:tblLayout w:type="fixed"/>
+        <w:tblLook w:val="04A0" w:firstRow="1" w:lastRow="0" w:firstColumn="1" w:lastColumn="0" w:noHBand="0" w:noVBand="1"/>
+      </w:tblPr>
+      <w:tblGrid>
+        <w:gridCol w:w="4500"/>
+        <w:gridCol w:w="4500"/>
+      </w:tblGrid>
+      <w:tr>
+        <w:trPr>
+          <w:jc w:val="center"/>
+        </w:trPr>
+        <w:tc>
+          <w:tcPr>
+            <w:tcW w:w="4500" w:type="dxa"/>
+          </w:tcPr>
+          <w:p>
+            <w:pPr>
+              <w:jc w:val="center"/>
+            </w:pPr>
+            <w:r>
+              <w:drawing>
+                <wp:inline xmlns:a="http://schemas.openxmlformats.org/drawingml/2006/main" xmlns:pic="http://schemas.openxmlformats.org/drawingml/2006/picture">
+                  <wp:extent cx="2628000" cy="1930704"/>
+                  <wp:docPr id="914607250" name="Picture 914607250"/>
+                  <wp:cNvGraphicFramePr>
+                    <a:graphicFrameLocks noChangeAspect="1"/>
+                  </wp:cNvGraphicFramePr>
+                  <a:graphic>
+                    <a:graphicData uri="http://schemas.openxmlformats.org/drawingml/2006/picture">
+                      <pic:pic>
+                        <pic:nvPicPr>
+                          <pic:cNvPr id="0" name="2844372299_d.jpg"/>
+                          <pic:cNvPicPr/>
+                        </pic:nvPicPr>
+                        <pic:blipFill>
+                          <a:blip r:embed="rId19"/>
+                          <a:stretch>
+                            <a:fillRect/>
+                          </a:stretch>
+                        </pic:blipFill>
+                        <pic:spPr>
+                          <a:xfrm>
+                            <a:off x="0" y="0"/>
+                            <a:ext cx="2628000" cy="1930704"/>
+                          </a:xfrm>
+                          <a:prstGeom prst="rect"/>
+                        </pic:spPr>
+                      </pic:pic>
+                    </a:graphicData>
+                  </a:graphic>
+                </wp:inline>
+              </w:drawing>
+            </w:r>
+          </w:p>
+          <w:p>
+            <w:pPr>
+              <w:jc w:val="center"/>
+            </w:pPr>
+            <w:r>
+              <w:rPr>
+                <w:rFonts w:ascii="Times New Roman" w:hAnsi="Times New Roman" w:cs="Times New Roman"/>
+                <w:b/>
+                <w:bCs/>
+                <w:highlight w:val="yellow"/>
+                <w:lang w:val="tr-TR"/>
+              </w:rPr>
+              <w:t>Shutter id: 2844372299</w:t>
+            </w:r>
+          </w:p>
+          <w:p>
+            <w:pPr>
+              <w:jc w:val="center"/>
+              <w:rPr>
+                <w:rFonts w:ascii="Times New Roman" w:hAnsi="Times New Roman" w:cs="Times New Roman"/>
+                <w:lang w:val="tr-TR"/>
+              </w:rPr>
+            </w:pPr>
+            <w:r>
+              <w:rPr>
+                <w:rFonts w:ascii="Times New Roman" w:hAnsi="Times New Roman" w:cs="Times New Roman"/>
+                <w:b/>
+                <w:bCs/>
+                <w:lang w:val="tr-TR"/>
+              </w:rPr>
+              <w:t>Görsel E:</w:t>
+            </w:r>
+            <w:r>
+              <w:rPr>
+                <w:rFonts w:ascii="Times New Roman" w:hAnsi="Times New Roman" w:cs="Times New Roman"/>
+                <w:lang w:val="tr-TR"/>
+              </w:rPr>
+              <w:t xml:space="preserve"> Kalsiyum karbonat içeren bir kayacın hidroklorik asitle tepkimesi</w:t>
+            </w:r>
+          </w:p>
+        </w:tc>
+        <w:tc>
+          <w:tcPr>
+            <w:tcW w:w="4500" w:type="dxa"/>
+          </w:tcPr>
+          <w:p>
+            <w:pPr>
+              <w:jc w:val="center"/>
+            </w:pPr>
+            <w:r>
+              <w:drawing>
+                <wp:inline xmlns:a="http://schemas.openxmlformats.org/drawingml/2006/main" xmlns:pic="http://schemas.openxmlformats.org/drawingml/2006/picture">
+                  <wp:extent cx="2628000" cy="1653888"/>
+                  <wp:docPr id="914607250" name="Picture 914607250"/>
+                  <wp:cNvGraphicFramePr>
+                    <a:graphicFrameLocks noChangeAspect="1"/>
+                  </wp:cNvGraphicFramePr>
+                  <a:graphic>
+                    <a:graphicData uri="http://schemas.openxmlformats.org/drawingml/2006/picture">
+                      <pic:pic>
+                        <pic:nvPicPr>
+                          <pic:cNvPr id="0" name="2739301869_d.jpg"/>
+                          <pic:cNvPicPr/>
+                        </pic:nvPicPr>
+                        <pic:blipFill>
+                          <a:blip r:embed="rId20"/>
+                          <a:stretch>
+                            <a:fillRect/>
+                          </a:stretch>
+                        </pic:blipFill>
+                        <pic:spPr>
+                          <a:xfrm>
+                            <a:off x="0" y="0"/>
+                            <a:ext cx="2628000" cy="1653888"/>
+                          </a:xfrm>
+                          <a:prstGeom prst="rect"/>
+                        </pic:spPr>
+                      </pic:pic>
+                    </a:graphicData>
+                  </a:graphic>
+                </wp:inline>
+              </w:drawing>
+            </w:r>
+          </w:p>
+          <w:p>
+            <w:pPr>
+              <w:jc w:val="center"/>
+            </w:pPr>
+            <w:r>
+              <w:rPr>
+                <w:rFonts w:ascii="Times New Roman" w:hAnsi="Times New Roman" w:cs="Times New Roman"/>
+                <w:b/>
+                <w:bCs/>
+                <w:highlight w:val="yellow"/>
+                <w:lang w:val="tr-TR"/>
+              </w:rPr>
+              <w:t>Shutter id: 2739301869</w:t>
+            </w:r>
+          </w:p>
+          <w:p>
+            <w:pPr>
+              <w:jc w:val="center"/>
+              <w:rPr>
+                <w:rFonts w:ascii="Times New Roman" w:hAnsi="Times New Roman" w:cs="Times New Roman"/>
+                <w:lang w:val="tr-TR"/>
+              </w:rPr>
+            </w:pPr>
+            <w:r>
+              <w:rPr>
+                <w:rFonts w:ascii="Times New Roman" w:hAnsi="Times New Roman" w:cs="Times New Roman"/>
+                <w:b/>
+                <w:bCs/>
+                <w:lang w:val="tr-TR"/>
+              </w:rPr>
+              <w:t>Görsel F:</w:t>
+            </w:r>
+            <w:r>
+              <w:rPr>
+                <w:rFonts w:ascii="Times New Roman" w:hAnsi="Times New Roman" w:cs="Times New Roman"/>
+                <w:lang w:val="tr-TR"/>
+              </w:rPr>
+              <w:t xml:space="preserve"> Suyun buharlaşmasıyla Tuz Gölü’nde biriken tuz</w:t>
+            </w:r>
+          </w:p>
+        </w:tc>
+      </w:tr>
+    </w:tbl>
     <w:p>
       <w:pPr>
         <w:keepNext/>
@@ -4149,6 +4413,7 @@
           <w:bCs/>
           <w:lang w:val="tr-TR"/>
         </w:rPr>
+        <w:lastRenderedPageBreak/>
         <w:t>Örnek-Çözüm Atölyesi 2.26.</w:t>
       </w:r>
     </w:p>
@@ -4621,7 +4886,7 @@
         <mc:AlternateContent>
           <mc:Choice Requires="wps">
             <w:drawing>
-              <wp:anchor distT="0" distB="0" distL="114300" distR="114300" simplePos="0" relativeHeight="251654144" behindDoc="0" locked="0" layoutInCell="1" allowOverlap="1" wp14:anchorId="523FB3BA" wp14:editId="70DEC307">
+              <wp:anchor distT="0" distB="0" distL="114300" distR="114300" simplePos="0" relativeHeight="251653120" behindDoc="0" locked="0" layoutInCell="1" allowOverlap="1" wp14:anchorId="523FB3BA" wp14:editId="70DEC307">
                 <wp:simplePos x="0" y="0"/>
                 <wp:positionH relativeFrom="column">
                   <wp:posOffset>498916</wp:posOffset>
@@ -5157,7 +5422,7 @@
         <mc:AlternateContent>
           <mc:Choice Requires="wps">
             <w:drawing>
-              <wp:anchor distT="0" distB="0" distL="114300" distR="114300" simplePos="0" relativeHeight="251655168" behindDoc="0" locked="0" layoutInCell="1" allowOverlap="1" wp14:anchorId="2CECE94B" wp14:editId="17BE9E91">
+              <wp:anchor distT="0" distB="0" distL="114300" distR="114300" simplePos="0" relativeHeight="251654144" behindDoc="0" locked="0" layoutInCell="1" allowOverlap="1" wp14:anchorId="2CECE94B" wp14:editId="17BE9E91">
                 <wp:simplePos x="0" y="0"/>
                 <wp:positionH relativeFrom="column">
                   <wp:posOffset>498916</wp:posOffset>
@@ -5260,49 +5525,42 @@
           <w:rFonts w:ascii="Times New Roman" w:hAnsi="Times New Roman" w:cs="Times New Roman"/>
           <w:lang w:val="tr-TR"/>
         </w:rPr>
-        <w:t xml:space="preserve">Grubunuzla birlikte sıcaklığın ve ortak iyonun bir tuzun sudaki çözünürlüğüne etkisini araştırmak üzere bir deney tasarlayınız. Deneyiniz için farklı gözlem ortamları oluşturunuz (örneğin kireç suyunun farklı sıcaklıklarda gözlemlenmesi, doymuş bir tuz çözeltisine ortak iyon içeren bir maddenin eklenmesi). Araştırma sorunuzu, değişkenlerinizi ve deney basamaklarınızı belirleyerek öğretmeninizin onayıyla deneyinizi güvenlik kurallarına uygun şekilde uygulayınız. Deney verilerinizi kaydederek çıkarımlarda bulununuz ve çıkarımlarınızı Le Chatelier ilkesi ile açıklayan </w:t>
-      </w:r>
-      <w:r>
-        <w:rPr>
-          <w:rFonts w:ascii="Times New Roman" w:hAnsi="Times New Roman" w:cs="Times New Roman"/>
+        <w:t>Grubunuzla birlikte sıcaklığın ve ortak iyonun bir tuzun sudaki çözünürlüğüne etkisini araştırmak üzere bir deney tasarlayınız. Deneyiniz için farklı gözlem ortamları oluşturunuz (örneğin kireç suyunun farklı sıcaklıklarda gözlemlenmesi, doymuş bir tuz çözeltisine ortak iyon içeren bir maddenin eklenmesi). Araştırma sorunuzu, değişkenlerinizi ve deney basamaklarınızı belirleyerek öğretmeninizin onayıyla deneyinizi güvenlik kurallarına uygun şekilde uygulayınız. Deney verilerinizi kaydederek çıkarımlarda bulununuz ve çıkarımlarınızı Le Chatelier ilkesi ile açıklayan bir deney raporu hazırlayınız. Raporunuzu sınıfınızda sununuz. Çalışmanızın sonunda öğrenme sürecinizi ve hedeflerinize ulaşma düzeyinizi değerlendiriniz.</w:t>
+      </w:r>
+    </w:p>
+    <w:p>
+      <w:pPr>
+        <w:jc w:val="both"/>
+        <w:rPr>
+          <w:rFonts w:ascii="Times New Roman" w:hAnsi="Times New Roman" w:cs="Times New Roman"/>
+          <w:lang w:val="tr-TR"/>
+        </w:rPr>
+      </w:pPr>
+      <w:r>
+        <w:rPr>
+          <w:rFonts w:ascii="Times New Roman" w:hAnsi="Times New Roman" w:cs="Times New Roman"/>
+          <w:lang w:val="tr-TR"/>
+        </w:rPr>
+        <w:t>Performans göreviniz, karekodda yer alan “Dereceli Puanlama Anahtarı” ile değerlendirilecektir.</w:t>
+      </w:r>
+    </w:p>
+    <w:p>
+      <w:pPr>
+        <w:rPr>
+          <w:rFonts w:ascii="Times New Roman" w:hAnsi="Times New Roman" w:cs="Times New Roman"/>
+          <w:lang w:val="tr-TR"/>
+        </w:rPr>
+      </w:pPr>
+      <w:r>
+        <w:rPr>
+          <w:noProof/>
           <w:lang w:val="tr-TR"/>
         </w:rPr>
         <w:lastRenderedPageBreak/>
-        <w:t>bir deney raporu hazırlayınız. Raporunuzu sınıfınızda sununuz. Çalışmanızın sonunda öğrenme sürecinizi ve hedeflerinize ulaşma düzeyinizi değerlendiriniz.</w:t>
-      </w:r>
-    </w:p>
-    <w:p>
-      <w:pPr>
-        <w:jc w:val="both"/>
-        <w:rPr>
-          <w:rFonts w:ascii="Times New Roman" w:hAnsi="Times New Roman" w:cs="Times New Roman"/>
-          <w:lang w:val="tr-TR"/>
-        </w:rPr>
-      </w:pPr>
-      <w:r>
-        <w:rPr>
-          <w:rFonts w:ascii="Times New Roman" w:hAnsi="Times New Roman" w:cs="Times New Roman"/>
-          <w:lang w:val="tr-TR"/>
-        </w:rPr>
-        <w:t>Performans göreviniz, karekodda yer alan “Dereceli Puanlama Anahtarı” ile değerlendirilecektir.</w:t>
-      </w:r>
-    </w:p>
-    <w:p>
-      <w:pPr>
-        <w:rPr>
-          <w:rFonts w:ascii="Times New Roman" w:hAnsi="Times New Roman" w:cs="Times New Roman"/>
-          <w:lang w:val="tr-TR"/>
-        </w:rPr>
-      </w:pPr>
-      <w:r>
-        <w:rPr>
-          <w:noProof/>
-          <w:lang w:val="tr-TR"/>
-        </w:rPr>
         <mc:AlternateContent>
           <mc:Choice Requires="wps">
             <w:drawing>
-              <wp:anchor distT="0" distB="0" distL="114300" distR="114300" simplePos="0" relativeHeight="251660288" behindDoc="0" locked="0" layoutInCell="1" allowOverlap="1" wp14:anchorId="06D5DC9F" wp14:editId="557D7F3A">
+              <wp:anchor distT="0" distB="0" distL="114300" distR="114300" simplePos="0" relativeHeight="251659264" behindDoc="0" locked="0" layoutInCell="1" allowOverlap="1" wp14:anchorId="06D5DC9F" wp14:editId="557D7F3A">
                 <wp:simplePos x="0" y="0"/>
                 <wp:positionH relativeFrom="column">
                   <wp:align>right</wp:align>
@@ -5575,7 +5833,7 @@
         <mc:AlternateContent>
           <mc:Choice Requires="wps">
             <w:drawing>
-              <wp:anchor distT="0" distB="0" distL="114300" distR="114300" simplePos="0" relativeHeight="251656192" behindDoc="0" locked="0" layoutInCell="1" allowOverlap="1" wp14:anchorId="6AA1443B" wp14:editId="47C3898A">
+              <wp:anchor distT="0" distB="0" distL="114300" distR="114300" simplePos="0" relativeHeight="251655168" behindDoc="0" locked="0" layoutInCell="1" allowOverlap="1" wp14:anchorId="6AA1443B" wp14:editId="47C3898A">
                 <wp:simplePos x="0" y="0"/>
                 <wp:positionH relativeFrom="column">
                   <wp:posOffset>498916</wp:posOffset>
@@ -5789,7 +6047,7 @@
                 <wp:extent cx="1955800" cy="615950"/>
                 <wp:effectExtent l="0" t="0" r="12700" b="19050"/>
                 <wp:wrapTopAndBottom/>
-                <wp:docPr id="900006" name="Rectangle 7"/>
+                <wp:docPr id="738247806" name="Rectangle 7"/>
                 <wp:cNvGraphicFramePr/>
                 <a:graphic xmlns:a="http://schemas.openxmlformats.org/drawingml/2006/main">
                   <a:graphicData uri="http://schemas.microsoft.com/office/word/2010/wordprocessingShape">
@@ -5921,7 +6179,7 @@
         <mc:AlternateContent>
           <mc:Choice Requires="wps">
             <w:drawing>
-              <wp:anchor distT="0" distB="0" distL="114300" distR="114300" simplePos="0" relativeHeight="251661312" behindDoc="0" locked="0" layoutInCell="1" allowOverlap="1" wp14:anchorId="4A86A824" wp14:editId="2AED3F47">
+              <wp:anchor distT="0" distB="0" distL="114300" distR="114300" simplePos="0" relativeHeight="251662336" behindDoc="0" locked="0" layoutInCell="1" allowOverlap="1" wp14:anchorId="4A86A824" wp14:editId="2AED3F47">
                 <wp:simplePos x="0" y="0"/>
                 <wp:positionH relativeFrom="column">
                   <wp:align>right</wp:align>
@@ -5932,7 +6190,7 @@
                 <wp:extent cx="1955800" cy="615950"/>
                 <wp:effectExtent l="0" t="0" r="12700" b="19050"/>
                 <wp:wrapTopAndBottom/>
-                <wp:docPr id="900007" name="Rectangle 7"/>
+                <wp:docPr id="914607248" name="Rectangle 7"/>
                 <wp:cNvGraphicFramePr/>
                 <a:graphic xmlns:a="http://schemas.openxmlformats.org/drawingml/2006/main">
                   <a:graphicData uri="http://schemas.microsoft.com/office/word/2010/wordprocessingShape">
@@ -6051,7 +6309,7 @@
         <mc:AlternateContent>
           <mc:Choice Requires="wps">
             <w:drawing>
-              <wp:anchor distT="0" distB="0" distL="114300" distR="114300" simplePos="0" relativeHeight="251657216" behindDoc="0" locked="0" layoutInCell="1" allowOverlap="1" wp14:anchorId="33804182" wp14:editId="5A5DF1EA">
+              <wp:anchor distT="0" distB="0" distL="114300" distR="114300" simplePos="0" relativeHeight="251656192" behindDoc="0" locked="0" layoutInCell="1" allowOverlap="1" wp14:anchorId="33804182" wp14:editId="5A5DF1EA">
                 <wp:simplePos x="0" y="0"/>
                 <wp:positionH relativeFrom="column">
                   <wp:posOffset>498916</wp:posOffset>
@@ -6138,7 +6396,6 @@
           <w:bCs/>
           <w:lang w:val="tr-TR"/>
         </w:rPr>
-        <w:lastRenderedPageBreak/>
         <w:t>Bilgi Köşesi 2.4.</w:t>
       </w:r>
     </w:p>
@@ -6254,12 +6511,16 @@
           <w:insideV w:val="nil"/>
         </w:tblBorders>
         <w:tblLayout w:type="fixed"/>
+        <w:tblLook w:val="04A0" w:firstRow="1" w:lastRow="0" w:firstColumn="1" w:lastColumn="0" w:noHBand="0" w:noVBand="1"/>
       </w:tblPr>
       <w:tblGrid>
         <w:gridCol w:w="4500"/>
         <w:gridCol w:w="4500"/>
       </w:tblGrid>
       <w:tr>
+        <w:trPr>
+          <w:jc w:val="center"/>
+        </w:trPr>
         <w:tc>
           <w:tcPr>
             <w:tcW w:w="4500" w:type="dxa"/>
@@ -6269,22 +6530,26 @@
               <w:jc w:val="center"/>
             </w:pPr>
             <w:r>
+              <w:rPr>
+                <w:noProof/>
+              </w:rPr>
               <w:drawing>
-                <wp:inline xmlns:a="http://schemas.openxmlformats.org/drawingml/2006/main" xmlns:pic="http://schemas.openxmlformats.org/drawingml/2006/picture">
+                <wp:inline distT="0" distB="0" distL="0" distR="0" wp14:anchorId="111EA76C" wp14:editId="60099FC4">
                   <wp:extent cx="2452316" cy="1800000"/>
+                  <wp:effectExtent l="0" t="0" r="0" b="0"/>
                   <wp:docPr id="900015" name="Picture 900015"/>
                   <wp:cNvGraphicFramePr>
-                    <a:graphicFrameLocks noChangeAspect="1"/>
+                    <a:graphicFrameLocks xmlns:a="http://schemas.openxmlformats.org/drawingml/2006/main" noChangeAspect="1"/>
                   </wp:cNvGraphicFramePr>
-                  <a:graphic>
+                  <a:graphic xmlns:a="http://schemas.openxmlformats.org/drawingml/2006/main">
                     <a:graphicData uri="http://schemas.openxmlformats.org/drawingml/2006/picture">
-                      <pic:pic>
+                      <pic:pic xmlns:pic="http://schemas.openxmlformats.org/drawingml/2006/picture">
                         <pic:nvPicPr>
                           <pic:cNvPr id="0" name="2246580921_d.jpg"/>
                           <pic:cNvPicPr/>
                         </pic:nvPicPr>
                         <pic:blipFill>
-                          <a:blip r:embed="rId15"/>
+                          <a:blip r:embed="rId11"/>
                           <a:stretch>
                             <a:fillRect/>
                           </a:stretch>
@@ -6294,7 +6559,9 @@
                             <a:off x="0" y="0"/>
                             <a:ext cx="2452316" cy="1800000"/>
                           </a:xfrm>
-                          <a:prstGeom prst="rect"/>
+                          <a:prstGeom prst="rect">
+                            <a:avLst/>
+                          </a:prstGeom>
                         </pic:spPr>
                       </pic:pic>
                     </a:graphicData>
@@ -6315,7 +6582,7 @@
                 <w:highlight w:val="yellow"/>
                 <w:lang w:val="tr-TR"/>
               </w:rPr>
-              <w:t xml:space="preserve">Shutter id: 2246580921</w:t>
+              <w:t>Shutter id: 2246580921</w:t>
             </w:r>
           </w:p>
           <w:p>
@@ -6327,7 +6594,7 @@
                 <w:rFonts w:ascii="Times New Roman" w:hAnsi="Times New Roman" w:cs="Times New Roman"/>
                 <w:lang w:val="tr-TR"/>
               </w:rPr>
-              <w:t xml:space="preserve">Böbrekten çıkarılmış bir böbrek taşı</w:t>
+              <w:t>Böbrekten çıkarılmış bir böbrek taşı</w:t>
             </w:r>
           </w:p>
         </w:tc>
@@ -6340,22 +6607,26 @@
               <w:jc w:val="center"/>
             </w:pPr>
             <w:r>
+              <w:rPr>
+                <w:noProof/>
+              </w:rPr>
               <w:drawing>
-                <wp:inline xmlns:a="http://schemas.openxmlformats.org/drawingml/2006/main" xmlns:pic="http://schemas.openxmlformats.org/drawingml/2006/picture">
+                <wp:inline distT="0" distB="0" distL="0" distR="0" wp14:anchorId="6C43119E" wp14:editId="6407DE6C">
                   <wp:extent cx="2450090" cy="1799999"/>
+                  <wp:effectExtent l="0" t="0" r="0" b="0"/>
                   <wp:docPr id="900016" name="Picture 900016"/>
                   <wp:cNvGraphicFramePr>
-                    <a:graphicFrameLocks noChangeAspect="1"/>
+                    <a:graphicFrameLocks xmlns:a="http://schemas.openxmlformats.org/drawingml/2006/main" noChangeAspect="1"/>
                   </wp:cNvGraphicFramePr>
-                  <a:graphic>
+                  <a:graphic xmlns:a="http://schemas.openxmlformats.org/drawingml/2006/main">
                     <a:graphicData uri="http://schemas.openxmlformats.org/drawingml/2006/picture">
-                      <pic:pic>
+                      <pic:pic xmlns:pic="http://schemas.openxmlformats.org/drawingml/2006/picture">
                         <pic:nvPicPr>
                           <pic:cNvPr id="0" name="2723739217_d.jpg"/>
                           <pic:cNvPicPr/>
                         </pic:nvPicPr>
                         <pic:blipFill>
-                          <a:blip r:embed="rId16"/>
+                          <a:blip r:embed="rId12"/>
                           <a:stretch>
                             <a:fillRect/>
                           </a:stretch>
@@ -6365,7 +6636,9 @@
                             <a:off x="0" y="0"/>
                             <a:ext cx="2450090" cy="1799999"/>
                           </a:xfrm>
-                          <a:prstGeom prst="rect"/>
+                          <a:prstGeom prst="rect">
+                            <a:avLst/>
+                          </a:prstGeom>
                         </pic:spPr>
                       </pic:pic>
                     </a:graphicData>
@@ -6386,7 +6659,7 @@
                 <w:highlight w:val="yellow"/>
                 <w:lang w:val="tr-TR"/>
               </w:rPr>
-              <w:t xml:space="preserve">Shutter id: 2723739217</w:t>
+              <w:t>Shutter id: 2723739217</w:t>
             </w:r>
           </w:p>
           <w:p>
@@ -6398,7 +6671,7 @@
                 <w:rFonts w:ascii="Times New Roman" w:hAnsi="Times New Roman" w:cs="Times New Roman"/>
                 <w:lang w:val="tr-TR"/>
               </w:rPr>
-              <w:t xml:space="preserve">Ispanak ve pancar içeren bir salata</w:t>
+              <w:t>Ispanak ve pancar içeren bir salata</w:t>
             </w:r>
           </w:p>
         </w:tc>
@@ -6422,7 +6695,7 @@
         <mc:AlternateContent>
           <mc:Choice Requires="wps">
             <w:drawing>
-              <wp:anchor distT="0" distB="0" distL="114300" distR="114300" simplePos="0" relativeHeight="251658240" behindDoc="0" locked="0" layoutInCell="1" allowOverlap="1" wp14:anchorId="6116881B" wp14:editId="38705571">
+              <wp:anchor distT="0" distB="0" distL="114300" distR="114300" simplePos="0" relativeHeight="251657216" behindDoc="0" locked="0" layoutInCell="1" allowOverlap="1" wp14:anchorId="6116881B" wp14:editId="38705571">
                 <wp:simplePos x="0" y="0"/>
                 <wp:positionH relativeFrom="column">
                   <wp:posOffset>498916</wp:posOffset>
@@ -6925,7 +7198,6 @@
           <w:rFonts w:ascii="Times New Roman" w:hAnsi="Times New Roman" w:cs="Times New Roman"/>
           <w:lang w:val="tr-TR"/>
         </w:rPr>
-        <w:lastRenderedPageBreak/>
         <w:t>4. Çözünmesi endotermik olan BaSO</w:t>
       </w:r>
       <w:r>
@@ -7407,6 +7679,7 @@
           <w:rFonts w:ascii="Times New Roman" w:hAnsi="Times New Roman" w:cs="Times New Roman"/>
           <w:lang w:val="tr-TR"/>
         </w:rPr>
+        <w:lastRenderedPageBreak/>
         <w:t>……………………………………………………………………………………………</w:t>
       </w:r>
     </w:p>
@@ -7876,7 +8149,7 @@
         <mc:AlternateContent>
           <mc:Choice Requires="wps">
             <w:drawing>
-              <wp:anchor distT="0" distB="0" distL="114300" distR="114300" simplePos="0" relativeHeight="251659264" behindDoc="0" locked="0" layoutInCell="1" allowOverlap="1" wp14:anchorId="488A9D87" wp14:editId="08CA16D8">
+              <wp:anchor distT="0" distB="0" distL="114300" distR="114300" simplePos="0" relativeHeight="251658240" behindDoc="0" locked="0" layoutInCell="1" allowOverlap="1" wp14:anchorId="488A9D87" wp14:editId="08CA16D8">
                 <wp:simplePos x="0" y="0"/>
                 <wp:positionH relativeFrom="column">
                   <wp:posOffset>498916</wp:posOffset>
@@ -7975,7 +8248,7 @@
         <mc:AlternateContent>
           <mc:Choice Requires="wps">
             <w:drawing>
-              <wp:anchor distT="0" distB="0" distL="114300" distR="114300" simplePos="0" relativeHeight="251662336" behindDoc="0" locked="0" layoutInCell="1" allowOverlap="1" wp14:anchorId="4BDB04EE" wp14:editId="2C58FB99">
+              <wp:anchor distT="0" distB="0" distL="114300" distR="114300" simplePos="0" relativeHeight="251663360" behindDoc="0" locked="0" layoutInCell="1" allowOverlap="1" wp14:anchorId="4BDB04EE" wp14:editId="2C58FB99">
                 <wp:simplePos x="0" y="0"/>
                 <wp:positionH relativeFrom="column">
                   <wp:align>right</wp:align>
@@ -8148,8 +8421,8 @@
       </w:pPr>
     </w:p>
     <w:sectPr>
-      <w:footerReference w:type="even" r:id="rId11"/>
-      <w:footerReference w:type="default" r:id="rId12"/>
+      <w:footerReference w:type="even" r:id="rId13"/>
+      <w:footerReference w:type="default" r:id="rId14"/>
       <w:pgSz w:w="12240" w:h="15840"/>
       <w:pgMar w:top="1440" w:right="1440" w:bottom="1440" w:left="1440" w:header="708" w:footer="708" w:gutter="0"/>
       <w:cols w:space="708"/>

</xml_diff>

<commit_message>
2.14 Gorsel E: kayac-asit fotografi yerine sirkede kabugu cozunen yumurta fotografi
</commit_message>
<xml_diff>
--- a/Kim11-2-14-Cozunurluge-Etki-Eden-Faktorler.docx
+++ b/Kim11-2-14-Cozunurluge-Etki-Eden-Faktorler.docx
@@ -4235,8 +4235,8 @@
             <w:r>
               <w:drawing>
                 <wp:inline xmlns:a="http://schemas.openxmlformats.org/drawingml/2006/main" xmlns:pic="http://schemas.openxmlformats.org/drawingml/2006/picture">
-                  <wp:extent cx="2628000" cy="1930704"/>
-                  <wp:docPr id="914607250" name="Picture 914607250"/>
+                  <wp:extent cx="2538461" cy="1980000"/>
+                  <wp:docPr id="914607252" name="Picture 914607252"/>
                   <wp:cNvGraphicFramePr>
                     <a:graphicFrameLocks noChangeAspect="1"/>
                   </wp:cNvGraphicFramePr>
@@ -4244,11 +4244,11 @@
                     <a:graphicData uri="http://schemas.openxmlformats.org/drawingml/2006/picture">
                       <pic:pic>
                         <pic:nvPicPr>
-                          <pic:cNvPr id="0" name="2844372299_d.jpg"/>
+                          <pic:cNvPr id="0" name="1500009101_d.jpg"/>
                           <pic:cNvPicPr/>
                         </pic:nvPicPr>
                         <pic:blipFill>
-                          <a:blip r:embed="rId19"/>
+                          <a:blip r:embed="rId22"/>
                           <a:stretch>
                             <a:fillRect/>
                           </a:stretch>
@@ -4256,7 +4256,7 @@
                         <pic:spPr>
                           <a:xfrm>
                             <a:off x="0" y="0"/>
-                            <a:ext cx="2628000" cy="1930704"/>
+                            <a:ext cx="2538461" cy="1980000"/>
                           </a:xfrm>
                           <a:prstGeom prst="rect"/>
                         </pic:spPr>
@@ -4279,7 +4279,7 @@
                 <w:highlight w:val="yellow"/>
                 <w:lang w:val="tr-TR"/>
               </w:rPr>
-              <w:t>Shutter id: 2844372299</w:t>
+              <w:t>Shutter id: 1500009101</w:t>
             </w:r>
           </w:p>
           <w:p>
@@ -4304,7 +4304,7 @@
                 <w:rFonts w:ascii="Times New Roman" w:hAnsi="Times New Roman" w:cs="Times New Roman"/>
                 <w:lang w:val="tr-TR"/>
               </w:rPr>
-              <w:t xml:space="preserve"> Kalsiyum karbonat içeren bir kayacın hidroklorik asitle tepkimesi</w:t>
+              <w:t xml:space="preserve"> Sirkede bekletilince kalsiyum karbonattan oluşan kabuğu çözünen yumurta</w:t>
             </w:r>
           </w:p>
         </w:tc>

</xml_diff>

<commit_message>
2.14 Bilgi Kosesi 2.4: bobrek tasi fotografi yerine bardaga dokulen su fotografi; gorseller metin sirasina gore dizildi
</commit_message>
<xml_diff>
--- a/Kim11-2-14-Cozunurluge-Etki-Eden-Faktorler.docx
+++ b/Kim11-2-14-Cozunurluge-Etki-Eden-Faktorler.docx
@@ -6534,83 +6534,6 @@
                 <w:noProof/>
               </w:rPr>
               <w:drawing>
-                <wp:inline distT="0" distB="0" distL="0" distR="0" wp14:anchorId="111EA76C" wp14:editId="60099FC4">
-                  <wp:extent cx="2452316" cy="1800000"/>
-                  <wp:effectExtent l="0" t="0" r="0" b="0"/>
-                  <wp:docPr id="900015" name="Picture 900015"/>
-                  <wp:cNvGraphicFramePr>
-                    <a:graphicFrameLocks xmlns:a="http://schemas.openxmlformats.org/drawingml/2006/main" noChangeAspect="1"/>
-                  </wp:cNvGraphicFramePr>
-                  <a:graphic xmlns:a="http://schemas.openxmlformats.org/drawingml/2006/main">
-                    <a:graphicData uri="http://schemas.openxmlformats.org/drawingml/2006/picture">
-                      <pic:pic xmlns:pic="http://schemas.openxmlformats.org/drawingml/2006/picture">
-                        <pic:nvPicPr>
-                          <pic:cNvPr id="0" name="2246580921_d.jpg"/>
-                          <pic:cNvPicPr/>
-                        </pic:nvPicPr>
-                        <pic:blipFill>
-                          <a:blip r:embed="rId11"/>
-                          <a:stretch>
-                            <a:fillRect/>
-                          </a:stretch>
-                        </pic:blipFill>
-                        <pic:spPr>
-                          <a:xfrm>
-                            <a:off x="0" y="0"/>
-                            <a:ext cx="2452316" cy="1800000"/>
-                          </a:xfrm>
-                          <a:prstGeom prst="rect">
-                            <a:avLst/>
-                          </a:prstGeom>
-                        </pic:spPr>
-                      </pic:pic>
-                    </a:graphicData>
-                  </a:graphic>
-                </wp:inline>
-              </w:drawing>
-            </w:r>
-          </w:p>
-          <w:p>
-            <w:pPr>
-              <w:jc w:val="center"/>
-            </w:pPr>
-            <w:r>
-              <w:rPr>
-                <w:rFonts w:ascii="Times New Roman" w:hAnsi="Times New Roman" w:cs="Times New Roman"/>
-                <w:b/>
-                <w:bCs/>
-                <w:highlight w:val="yellow"/>
-                <w:lang w:val="tr-TR"/>
-              </w:rPr>
-              <w:t>Shutter id: 2246580921</w:t>
-            </w:r>
-          </w:p>
-          <w:p>
-            <w:pPr>
-              <w:jc w:val="center"/>
-            </w:pPr>
-            <w:r>
-              <w:rPr>
-                <w:rFonts w:ascii="Times New Roman" w:hAnsi="Times New Roman" w:cs="Times New Roman"/>
-                <w:lang w:val="tr-TR"/>
-              </w:rPr>
-              <w:t>Böbrekten çıkarılmış bir böbrek taşı</w:t>
-            </w:r>
-          </w:p>
-        </w:tc>
-        <w:tc>
-          <w:tcPr>
-            <w:tcW w:w="4500" w:type="dxa"/>
-          </w:tcPr>
-          <w:p>
-            <w:pPr>
-              <w:jc w:val="center"/>
-            </w:pPr>
-            <w:r>
-              <w:rPr>
-                <w:noProof/>
-              </w:rPr>
-              <w:drawing>
                 <wp:inline distT="0" distB="0" distL="0" distR="0" wp14:anchorId="6C43119E" wp14:editId="6407DE6C">
                   <wp:extent cx="2450090" cy="1799999"/>
                   <wp:effectExtent l="0" t="0" r="0" b="0"/>
@@ -6672,6 +6595,77 @@
                 <w:lang w:val="tr-TR"/>
               </w:rPr>
               <w:t>Ispanak ve pancar içeren bir salata</w:t>
+            </w:r>
+          </w:p>
+        </w:tc>
+        <w:tc>
+          <w:tcPr>
+            <w:tcW w:w="4500" w:type="dxa"/>
+          </w:tcPr>
+          <w:p>
+            <w:pPr>
+              <w:jc w:val="center"/>
+            </w:pPr>
+            <w:r>
+              <w:drawing>
+                <wp:inline xmlns:a="http://schemas.openxmlformats.org/drawingml/2006/main" xmlns:pic="http://schemas.openxmlformats.org/drawingml/2006/picture">
+                  <wp:extent cx="2628000" cy="1927200"/>
+                  <wp:docPr id="914607253" name="Picture 914607253"/>
+                  <wp:cNvGraphicFramePr>
+                    <a:graphicFrameLocks noChangeAspect="1"/>
+                  </wp:cNvGraphicFramePr>
+                  <a:graphic>
+                    <a:graphicData uri="http://schemas.openxmlformats.org/drawingml/2006/picture">
+                      <pic:pic>
+                        <pic:nvPicPr>
+                          <pic:cNvPr id="0" name="2706245477_d.jpg"/>
+                          <pic:cNvPicPr/>
+                        </pic:nvPicPr>
+                        <pic:blipFill>
+                          <a:blip r:embed="rId23"/>
+                          <a:stretch>
+                            <a:fillRect/>
+                          </a:stretch>
+                        </pic:blipFill>
+                        <pic:spPr>
+                          <a:xfrm>
+                            <a:off x="0" y="0"/>
+                            <a:ext cx="2628000" cy="1927200"/>
+                          </a:xfrm>
+                          <a:prstGeom prst="rect"/>
+                        </pic:spPr>
+                      </pic:pic>
+                    </a:graphicData>
+                  </a:graphic>
+                </wp:inline>
+              </w:drawing>
+            </w:r>
+          </w:p>
+          <w:p>
+            <w:pPr>
+              <w:jc w:val="center"/>
+            </w:pPr>
+            <w:r>
+              <w:rPr>
+                <w:rFonts w:ascii="Times New Roman" w:hAnsi="Times New Roman" w:cs="Times New Roman"/>
+                <w:b/>
+                <w:bCs/>
+                <w:highlight w:val="yellow"/>
+                <w:lang w:val="tr-TR"/>
+              </w:rPr>
+              <w:t>Shutter id: 2706245477</w:t>
+            </w:r>
+          </w:p>
+          <w:p>
+            <w:pPr>
+              <w:jc w:val="center"/>
+            </w:pPr>
+            <w:r>
+              <w:rPr>
+                <w:rFonts w:ascii="Times New Roman" w:hAnsi="Times New Roman" w:cs="Times New Roman"/>
+                <w:lang w:val="tr-TR"/>
+              </w:rPr>
+              <w:t>Yeterli su içmek taş oluşma riskini azaltır</w:t>
             </w:r>
           </w:p>
         </w:tc>

</xml_diff>